<commit_message>
Replace bot FAQ with indexed Article source; simplify Knowledge Base link scan
- Chatbot Knowledge: FAQ (instant Q&A) replaced by Article, a proper
  trainable source (title + content) sharing the same indexed/indexing/
  queued/failed lifecycle as documents and URLs, with its own table,
  retrain/enable-disable/delete actions, and in-place editing
- Chat composer's knowledge-base quick replies now rank articles and
  exclude any that aren't indexed yet, not just disabled ones
- Add Document dialog: dropped the signed-in audience picker (matches
  the earlier change to Add URL) — new documents are always public
- Knowledge Base "Add website link" dialog: replaced scan depth/max
  pages selects with the same single-page/multiple-pages choice used
  for bot training URLs
- Synced v1 docs (AI-07, FEAT-009/020, FE-17, Requirements Overview) to
  the FAQ -> Article terminology and regenerated all deliverables

Co-Authored-By: Claude Sonnet 5 <noreply@anthropic.com>
</commit_message>
<xml_diff>
--- a/docs/v1/Mercury_V1_Feature_Listing.docx
+++ b/docs/v1/Mercury_V1_Feature_Listing.docx
@@ -1984,7 +1984,7 @@
               <w:rPr>
                 <w:sz w:val="18"/>
               </w:rPr>
-              <w:t>In-chat panel that searches Internal Knowledge and suggests trained FAQs relevant to the conversation's matched bot intent.</w:t>
+              <w:t>In-chat panel that searches Internal Knowledge and suggests trained articles relevant to the conversation's matched bot intent.</w:t>
             </w:r>
           </w:p>
         </w:tc>
@@ -2013,7 +2013,7 @@
               <w:rPr>
                 <w:sz w:val="18"/>
               </w:rPr>
-              <w:t>Ask Knowledge search panel; Suggested-reply dialog ranking FAQs by matched intent; Editable draft only (never auto-sent)</w:t>
+              <w:t>Ask Knowledge search panel; Quick-reply menu ranking trained articles by matched intent; Editable draft only (never auto-sent)</w:t>
             </w:r>
           </w:p>
         </w:tc>
@@ -3861,7 +3861,7 @@
               <w:rPr>
                 <w:sz w:val="18"/>
               </w:rPr>
-              <w:t>Articles tab: create/edit, category, groups, pin, review status (current/due/stale/draft); Documents tab: upload/add internal document; Links tab: add internal reference link</w:t>
+              <w:t>Articles tab: create/edit, category, groups, pin, review status (current/due/stale/draft); Documents tab: upload/add internal document; Links tab: add an internal reference link as a single page or a multi-page site scan</w:t>
             </w:r>
           </w:p>
         </w:tc>
@@ -4319,7 +4319,7 @@
               <w:rPr>
                 <w:sz w:val="18"/>
               </w:rPr>
-              <w:t>Add source document; Add source URL with crawl depth; Enable / disable a source ('use for answers'); Retrain a source; Delete a source; Training status: indexed/indexing/queued/failed + failure reason; Public vs. signed-in audience setting</w:t>
+              <w:t>Add source document; Add source URL as a single page or a multi-page site scan (admin-configurable scan depth/page-limit deferred to V2 — see AI-13/BE-15); Enable / disable a source ('use for answers'); Retrain a source; Delete a source; Training status: indexed/indexing/queued/failed + failure reason; Audience badge (public/signed-in) shown per source; audience is no longer admin-settable when adding a source in V1 — every new document or URL source is public by default</w:t>
             </w:r>
           </w:p>
         </w:tc>
@@ -4478,7 +4478,7 @@
           <w:color w:val="1B5E20"/>
           <w:sz w:val="22"/>
         </w:rPr>
-        <w:t>FEAT-020  Bot FAQ Management</w:t>
+        <w:t>FEAT-020  Bot Article Management</w:t>
       </w:r>
     </w:p>
     <w:tbl>
@@ -4515,7 +4515,7 @@
               <w:rPr>
                 <w:sz w:val="18"/>
               </w:rPr>
-              <w:t>Structured FAQs the bot can answer from directly, each tagged with the intents it matches.</w:t>
+              <w:t>Structured articles (title + content) the bot can answer from directly, each tagged with the intents it matches. Same indexing lifecycle as documents/URLs (status, chunks, retrain) rather than an instant, unindexed Q&amp;A pair.</w:t>
             </w:r>
           </w:p>
         </w:tc>
@@ -4544,7 +4544,7 @@
               <w:rPr>
                 <w:sz w:val="18"/>
               </w:rPr>
-              <w:t>Add / edit FAQ (category, question, answer); Tag FAQ with matched bot intents; Feeds Chat's suggested-reply ranking</w:t>
+              <w:t>Add / edit article (category, title, content); Tag article with matched bot intents; Feeds Chat's suggested-reply ranking</w:t>
             </w:r>
           </w:p>
         </w:tc>

</xml_diff>